<commit_message>
Decode DOCX character references exactly once
</commit_message>
<xml_diff>
--- a/test/fixtures/docx-inline-controls.docx
+++ b/test/fixtures/docx-inline-controls.docx
@@ -73,6 +73,21 @@
         <w:t>escaped &lt;text&gt;</w:t>
       </w:r>
     </w:p>
+    <w:p>
+      <w:r>
+        <w:t>Renée / Renée / Renée / 李华 / 💻</w:t>
+      </w:r>
+    </w:p>
+    <w:p>
+      <w:r>
+        <w:t>&lt;text&gt; "quoted" 'apostrophe' &amp;</w:t>
+      </w:r>
+    </w:p>
+    <w:p>
+      <w:r>
+        <w:t>Literal references: &amp;amp; / &amp;lt; / &amp;#65;</w:t>
+      </w:r>
+    </w:p>
   </w:body>
 </w:document>
 </file>
</xml_diff>

<commit_message>
Decode DOCX character references exactly once (#55)
</commit_message>
<xml_diff>
--- a/test/fixtures/docx-inline-controls.docx
+++ b/test/fixtures/docx-inline-controls.docx
@@ -73,6 +73,21 @@
         <w:t>escaped &lt;text&gt;</w:t>
       </w:r>
     </w:p>
+    <w:p>
+      <w:r>
+        <w:t>Renée / Renée / Renée / 李华 / 💻</w:t>
+      </w:r>
+    </w:p>
+    <w:p>
+      <w:r>
+        <w:t>&lt;text&gt; "quoted" 'apostrophe' &amp;</w:t>
+      </w:r>
+    </w:p>
+    <w:p>
+      <w:r>
+        <w:t>Literal references: &amp;amp; / &amp;lt; / &amp;#65;</w:t>
+      </w:r>
+    </w:p>
   </w:body>
 </w:document>
 </file>
</xml_diff>